<commit_message>
Structurer le flux inline des documents DOCX
</commit_message>
<xml_diff>
--- a/tests/fixtures/docx/basic-inspection.docx
+++ b/tests/fixtures/docx/basic-inspection.docx
@@ -54,10 +54,26 @@
         <w:t>i</w:t>
       </w:r>
       <w:r>
+        <w:t>Texte litteral [footnote:7]</w:t>
+      </w:r>
+      <w:r>
+        <w:t>avant tabulation</w:t>
         <w:tab/>
-        <w:t>après tabulation</w:t>
+        <w:t>apres tabulation</w:t>
         <w:br/>
-        <w:t>après saut</w:t>
+        <w:t>apres saut</w:t>
+        <w:footnoteReference w:id="7"/>
+        <w:drawing>
+          <w:docPr id="1" name="Image synthétique"/>
+          <a:blip r:embed="rIdImage"/>
+        </w:drawing>
+      </w:r>
+      <w:r>
+        <w:t>avant page</w:t>
+        <w:br w:type="page"/>
+        <w:t>apres page</w:t>
+        <w:br w:type="column"/>
+        <w:t>apres colonne</w:t>
       </w:r>
       <w:bookmarkStart w:id="12" w:name="repere_synthetique"/>
       <w:hyperlink r:id="rIdHyper">
@@ -68,17 +84,13 @@
           <w:t>lien</w:t>
         </w:r>
       </w:hyperlink>
-      <w:r>
-        <w:footnoteReference w:id="7"/>
-      </w:r>
+      <w:hyperlink w:anchor="repere_synthetique">
+        <w:r>
+          <w:t>lien interne</w:t>
+        </w:r>
+      </w:hyperlink>
       <w:r>
         <w:endnoteReference w:id="9"/>
-      </w:r>
-      <w:r>
-        <w:drawing>
-          <w:docPr id="1" name="Image synthétique"/>
-          <a:blip r:embed="rIdImage"/>
-        </w:drawing>
       </w:r>
     </w:p>
     <w:p>
@@ -129,7 +141,20 @@
   <w:footnote w:id="7">
     <w:p>
       <w:r>
-        <w:t>Note de bas de page synthétique.</w:t>
+        <w:t>Note de bas de page </w:t>
+      </w:r>
+      <w:r>
+        <w:rPr>
+          <w:i/>
+        </w:rPr>
+        <w:t>italique</w:t>
+        <w:br/>
+        <w:t>avec saut.</w:t>
+      </w:r>
+    </w:p>
+    <w:p>
+      <w:r>
+        <w:t>Second paragraphe de note.</w:t>
       </w:r>
     </w:p>
   </w:footnote>

</xml_diff>

<commit_message>
Résoudre les numérotations Word natives
</commit_message>
<xml_diff>
--- a/tests/fixtures/docx/basic-inspection.docx
+++ b/tests/fixtures/docx/basic-inspection.docx
@@ -171,7 +171,10 @@
 <file path=word/numbering.xml><?xml version="1.0" encoding="utf-8"?>
 <w:numbering xmlns:w="http://schemas.openxmlformats.org/wordprocessingml/2006/main">
   <w:abstractNum w:abstractNumId="1">
-    <w:lvl w:ilvl="1"/>
+    <w:lvl w:ilvl="1">
+      <w:numFmt w:val="decimal"/>
+      <w:lvlText w:val="%2."/>
+    </w:lvl>
   </w:abstractNum>
   <w:num w:numId="42">
     <w:abstractNumId w:val="1"/>

</xml_diff>